<commit_message>
Actualiza el estado del máster: admisión confirmada, no en proceso
Carta oficial del director académico (Roberto Therón Sánchez,
6/07/2026): Angel fue admitido al Máster en Sistemas Inteligentes de
la Universidad de Salamanca para 2026/27, primer plazo de matrícula ya
pagado, inicio de clases 28/09/2026. Corrige el CV y
formacion-academica.md, que aún decían "en proceso de solicitud".

Co-Authored-By: Claude Sonnet 5 <noreply@anthropic.com>
Claude-Session: https://claude.ai/code/session_012cTrmKnajgZbTDRsTMvpWi
</commit_message>
<xml_diff>
--- a/personal/cv/cv-mindrift.docx
+++ b/personal/cv/cv-mindrift.docx
@@ -23,7 +23,7 @@
         <w:spacing w:after="200"/>
         <w:jc w:val="center"/>
       </w:pPr>
-      <w:hyperlink w:history="1" r:id="rIdobhdycx7tamxs78a2u_i8">
+      <w:hyperlink w:history="1" r:id="rIdaacuf9nh5cuemfrtzwyak">
         <w:r>
           <w:rPr>
             <w:color w:val="1155CC"/>
@@ -42,7 +42,7 @@
         </w:rPr>
         <w:t xml:space="preserve">  ·  </w:t>
       </w:r>
-      <w:hyperlink w:history="1" r:id="rIdmc_p8ilbjtzhqal1lsyvt">
+      <w:hyperlink w:history="1" r:id="rIdthyie3ldpqh2qsah9mtug">
         <w:r>
           <w:rPr>
             <w:color w:val="1155CC"/>
@@ -90,7 +90,7 @@
           <w:sz w:val="20"/>
           <w:szCs w:val="20"/>
         </w:rPr>
-        <w:t xml:space="preserve">Ingeniero especialista en sistemas y redes de telecomunicaciones (Universidad Rusa de Transporte, RUT MIIT, diploma con distinción), con formación adicional en análisis predictivo y aprendizaje automático. Trilingüe real: español nativo, ruso C1 (seis años de instrucción universitaria completa en ruso) e inglés C2. Admisión en proceso al Máster Universitario en Sistemas Inteligentes (Universidad de Salamanca, España), con inicio previsto en septiembre de 2026. Combina conocimiento técnico profundo en ingeniería, programación y aprendizaje automático con capacidad real de trabajar y explicar contenido técnico en los tres idiomas.</w:t>
+        <w:t xml:space="preserve">Ingeniero especialista en sistemas y redes de telecomunicaciones (Universidad Rusa de Transporte, RUT MIIT, diploma con distinción), con formación adicional en análisis predictivo y aprendizaje automático. Trilingüe real: español nativo, ruso C1 (seis años de instrucción universitaria completa en ruso) e inglés C2. Admitido al Máster Universitario en Sistemas Inteligentes (Universidad de Salamanca, España), con inicio el 28 de septiembre de 2026. Combina conocimiento técnico profundo en ingeniería, programación y aprendizaje automático con capacidad real de trabajar y explicar contenido técnico en los tres idiomas.</w:t>
       </w:r>
     </w:p>
     <w:p>
@@ -206,7 +206,7 @@
           <w:sz w:val="19"/>
           <w:szCs w:val="19"/>
         </w:rPr>
-        <w:t xml:space="preserve">	Universidad de Salamanca, España — admisión en proceso, inicio previsto septiembre 2026</w:t>
+        <w:t xml:space="preserve">	Universidad de Salamanca, España — admitido, inicio 28 septiembre 2026</w:t>
       </w:r>
     </w:p>
     <w:p>

</xml_diff>

<commit_message>
Hace el CV genuinamente trilingüe (añade resumen en RU y EN)
El CV se documentaba como "trilingüe (ES/RU/EN)" pero el documento
entero estaba solo en español (hallazgo de la revisión previa a
fusionar). Añade un resumen equivalente en ruso e inglés bajo el
perfil profesional en español, sin perder la página única.

Co-Authored-By: Claude Sonnet 5 <noreply@anthropic.com>
Claude-Session: https://claude.ai/code/session_012cTrmKnajgZbTDRsTMvpWi
</commit_message>
<xml_diff>
--- a/personal/cv/cv-mindrift.docx
+++ b/personal/cv/cv-mindrift.docx
@@ -23,7 +23,7 @@
         <w:spacing w:after="200"/>
         <w:jc w:val="center"/>
       </w:pPr>
-      <w:hyperlink w:history="1" r:id="rIdaacuf9nh5cuemfrtzwyak">
+      <w:hyperlink w:history="1" r:id="rIdu_zllrzlvjov0lf_fpvft">
         <w:r>
           <w:rPr>
             <w:color w:val="1155CC"/>
@@ -42,7 +42,7 @@
         </w:rPr>
         <w:t xml:space="preserve">  ·  </w:t>
       </w:r>
-      <w:hyperlink w:history="1" r:id="rIdthyie3ldpqh2qsah9mtug">
+      <w:hyperlink w:history="1" r:id="rIdeijogi-iou8ioghggshph">
         <w:r>
           <w:rPr>
             <w:color w:val="1155CC"/>
@@ -91,6 +91,60 @@
           <w:szCs w:val="20"/>
         </w:rPr>
         <w:t xml:space="preserve">Ingeniero especialista en sistemas y redes de telecomunicaciones (Universidad Rusa de Transporte, RUT MIIT, diploma con distinción), con formación adicional en análisis predictivo y aprendizaje automático. Trilingüe real: español nativo, ruso C1 (seis años de instrucción universitaria completa en ruso) e inglés C2. Admitido al Máster Universitario en Sistemas Inteligentes (Universidad de Salamanca, España), con inicio el 28 de septiembre de 2026. Combina conocimiento técnico profundo en ingeniería, programación y aprendizaje automático con capacidad real de trabajar y explicar contenido técnico en los tres idiomas.</w:t>
+      </w:r>
+    </w:p>
+    <w:p>
+      <w:pPr>
+        <w:spacing w:after="60"/>
+      </w:pPr>
+      <w:r>
+        <w:rPr>
+          <w:b/>
+          <w:bCs/>
+          <w:i/>
+          <w:iCs/>
+          <w:color w:val="595959"/>
+          <w:sz w:val="18"/>
+          <w:szCs w:val="18"/>
+        </w:rPr>
+        <w:t xml:space="preserve">EN — </w:t>
+      </w:r>
+      <w:r>
+        <w:rPr>
+          <w:i/>
+          <w:iCs/>
+          <w:color w:val="595959"/>
+          <w:sz w:val="18"/>
+          <w:szCs w:val="18"/>
+        </w:rPr>
+        <w:t xml:space="preserve">Telecommunications systems and networks engineer (Russian University of Transport, RUT MIIT, diploma with distinction), with additional training in predictive analytics and machine learning. Genuinely trilingual: native Spanish, C1 Russian (six years of full university instruction in Russian), and C2 English. Admitted to the Master's in Intelligent Systems (University of Salamanca, Spain), starting September 28, 2026.</w:t>
+      </w:r>
+    </w:p>
+    <w:p>
+      <w:pPr>
+        <w:spacing w:after="200"/>
+      </w:pPr>
+      <w:r>
+        <w:rPr>
+          <w:b/>
+          <w:bCs/>
+          <w:i/>
+          <w:iCs/>
+          <w:color w:val="595959"/>
+          <w:sz w:val="18"/>
+          <w:szCs w:val="18"/>
+        </w:rPr>
+        <w:t xml:space="preserve">RU — </w:t>
+      </w:r>
+      <w:r>
+        <w:rPr>
+          <w:i/>
+          <w:iCs/>
+          <w:color w:val="595959"/>
+          <w:sz w:val="18"/>
+          <w:szCs w:val="18"/>
+        </w:rPr>
+        <w:t xml:space="preserve">Инженер по системам и сетям телекоммуникаций (Российский университет транспорта, РУТ (МИИТ), диплом с отличием), с дополнительной подготовкой в области предиктивной аналитики и машинного обучения. Действительно трёхъязычный: испанский — родной, русский — C1 (шесть лет полного университетского обучения на русском языке), английский — C2. Принят в магистратуру по интеллектуальным системам (Университет Саламанки, Испания), начало обучения 28 сентября 2026 года.</w:t>
       </w:r>
     </w:p>
     <w:p>

</xml_diff>

<commit_message>
Corrige certificación ELE inventada y actualiza cv-mindrift.docx
- Retira la certificación de profesor ELE ("Luch Znaniy") de
  formacion-academica.md y del texto propuesto de Avito: Angel
  confirmó que no la posee y no hay documento de origen que la
  respalde en su Drive. Se sustituye por la experiencia real
  (reseñas de Avito, alta como ИП) como base de la docencia.
- cv-mindrift.docx: aclara que la experiencia en RZD fue en
  prácticas, y añade la actividad de autónomo (traducción y
  docencia de español) como entrada de experiencia profesional.

Co-Authored-By: Claude Sonnet 5 <noreply@anthropic.com>
Claude-Session: https://claude.ai/code/session_01HbVaH1DVwrMuTNDFjbaP8S
</commit_message>
<xml_diff>
--- a/personal/cv/cv-mindrift.docx
+++ b/personal/cv/cv-mindrift.docx
@@ -437,7 +437,7 @@
           <w:sz w:val="21"/>
           <w:szCs w:val="21"/>
         </w:rPr>
-        <w:t xml:space="preserve">Técnico en telecomunicaciones (electromecánico)</w:t>
+        <w:t xml:space="preserve">Técnico en telecomunicaciones (electromecánico, prácticas)</w:t>
       </w:r>
       <w:r>
         <w:rPr>
@@ -499,6 +499,50 @@
           <w:szCs w:val="20"/>
         </w:rPr>
         <w:t xml:space="preserve">Proyecto de fin de carrera: diseño de red óptica primaria (DWDM, IP/MPLS-TP) para el tramo Moscú–Riazán.</w:t>
+      </w:r>
+    </w:p>
+    <w:p>
+      <w:pPr>
+        <w:tabs>
+          <w:tab w:val="right" w:pos="10080"/>
+        </w:tabs>
+        <w:spacing w:after="20"/>
+      </w:pPr>
+      <w:r>
+        <w:rPr>
+          <w:b/>
+          <w:bCs/>
+          <w:sz w:val="21"/>
+          <w:szCs w:val="21"/>
+        </w:rPr>
+        <w:t xml:space="preserve">Autónomo (ИП) — Traducción y docencia de español</w:t>
+      </w:r>
+      <w:r>
+        <w:rPr>
+          <w:i/>
+          <w:iCs/>
+          <w:color w:val="595959"/>
+          <w:sz w:val="19"/>
+          <w:szCs w:val="19"/>
+        </w:rPr>
+        <w:t xml:space="preserve">	Rusia, desde 2025 (docencia desde 2022)</w:t>
+      </w:r>
+    </w:p>
+    <w:p>
+      <w:pPr>
+        <w:pStyle w:val="ListParagraph"/>
+        <w:numPr>
+          <w:ilvl w:val="0"/>
+          <w:numId w:val="2"/>
+        </w:numPr>
+        <w:spacing w:after="60"/>
+      </w:pPr>
+      <w:r>
+        <w:rPr>
+          <w:sz w:val="20"/>
+          <w:szCs w:val="20"/>
+        </w:rPr>
+        <w:t xml:space="preserve">Traductor e intérprete y profesor de español para hispanohablantes/rusohablantes — negocio propio registrado, actividad principal de traducción escrita y oral (OKVED 74.30) y educación complementaria (OKVED 85.41). Valoración 5,0/5 sobre 38 reseñas de alumnos.</w:t>
       </w:r>
     </w:p>
     <w:p>

</xml_diff>

<commit_message>
Restaura la certificación de profesor de español (era real)
Angel confirmó y adjuntó los 4 documentos escaneados: el diploma
(№ 41665, Luch Znaniy, 2022, con su anexo de expediente) y los dos
certificados de formación continua (№ 168815 y № 230430). La
corrección anterior que los retiraba era un error — se restauran en
formacion-academica.md y en el texto propuesto de Avito, sin usar el
término "ELE" (no es una certificación de ese tipo, es una
cualificación rusa de profesor de español).

cv-mindrift.docx: añade el diploma de profesor de español a
Formación académica, junto a los otros dos ya existentes.

Co-Authored-By: Claude Sonnet 5 <noreply@anthropic.com>
Claude-Session: https://claude.ai/code/session_01HbVaH1DVwrMuTNDFjbaP8S
</commit_message>
<xml_diff>
--- a/personal/cv/cv-mindrift.docx
+++ b/personal/cv/cv-mindrift.docx
@@ -360,6 +360,48 @@
           <w:szCs w:val="19"/>
         </w:rPr>
         <w:t xml:space="preserve">Python, machine learning, redes neuronales profundas (CNN, RNN, Transformers) aplicadas a mantenimiento predictivo.</w:t>
+      </w:r>
+    </w:p>
+    <w:p>
+      <w:pPr>
+        <w:tabs>
+          <w:tab w:val="right" w:pos="10080"/>
+        </w:tabs>
+        <w:spacing w:after="20"/>
+      </w:pPr>
+      <w:r>
+        <w:rPr>
+          <w:b/>
+          <w:bCs/>
+          <w:sz w:val="21"/>
+          <w:szCs w:val="21"/>
+        </w:rPr>
+        <w:t xml:space="preserve">Diploma de Reciclaje Profesional — Profesor de Español («Учитель испанского языка»)</w:t>
+      </w:r>
+      <w:r>
+        <w:rPr>
+          <w:i/>
+          <w:iCs/>
+          <w:color w:val="595959"/>
+          <w:sz w:val="19"/>
+          <w:szCs w:val="19"/>
+        </w:rPr>
+        <w:t xml:space="preserve">	Luch Znaniy, Rusia — 2022</w:t>
+      </w:r>
+    </w:p>
+    <w:p>
+      <w:pPr>
+        <w:spacing w:after="60"/>
+      </w:pPr>
+      <w:r>
+        <w:rPr>
+          <w:i/>
+          <w:iCs/>
+          <w:color w:val="595959"/>
+          <w:sz w:val="19"/>
+          <w:szCs w:val="19"/>
+        </w:rPr>
+        <w:t xml:space="preserve">300 horas de formación pedagógica, más 2 certificados de formación continua en metodología de enseñanza de idiomas (2023, 2025).</w:t>
       </w:r>
     </w:p>
     <w:p>

</xml_diff>

<commit_message>
Ajusta los 3 CV a buenas prácticas de formato/ATS actuales
Investigado en fuentes de reclutamiento/ATS 2026: se corrigen tres
cosas concretas en los tres archivos, sin cambiar ningún dato:

- Fuente: ninguno declaraba una fuente explícita (dependían del
  valor por defecto del visor). Se fija Calibri, estándar y segura
  para ATS.
- Tamaño de los títulos de sección: 11pt -> 12,5pt, dentro del rango
  recomendado (12-13pt); el resto de tamaños ya cumplía.
- cv-python-dev.docx: la entrada de "Proyecto propio" (2021) estaba
  antes que las prácticas en RZD (2024-2026), rompiendo el orden
  cronológico inverso que se espera dentro de cada sección — se
  mueve al final del bloque de Experiencia.

El orden Formación antes de Experiencia se mantiene: es la excepción
documentada para perfiles recién graduados/sin experiencia larga.

Co-Authored-By: Claude Sonnet 5 <noreply@anthropic.com>
Claude-Session: https://claude.ai/code/session_01HbVaH1DVwrMuTNDFjbaP8S
</commit_message>
<xml_diff>
--- a/personal/cv/cv-mindrift.docx
+++ b/personal/cv/cv-mindrift.docx
@@ -75,8 +75,8 @@
           <w:b/>
           <w:bCs/>
           <w:color w:val="1F3864"/>
-          <w:sz w:val="22"/>
-          <w:szCs w:val="22"/>
+          <w:sz w:val="25"/>
+          <w:szCs w:val="25"/>
         </w:rPr>
         <w:t xml:space="preserve">PERFIL PROFESIONAL</w:t>
       </w:r>
@@ -160,8 +160,8 @@
           <w:b/>
           <w:bCs/>
           <w:color w:val="1F3864"/>
-          <w:sz w:val="22"/>
-          <w:szCs w:val="22"/>
+          <w:sz w:val="25"/>
+          <w:szCs w:val="25"/>
         </w:rPr>
         <w:t xml:space="preserve">IDIOMAS</w:t>
       </w:r>
@@ -230,8 +230,8 @@
           <w:b/>
           <w:bCs/>
           <w:color w:val="1F3864"/>
-          <w:sz w:val="22"/>
-          <w:szCs w:val="22"/>
+          <w:sz w:val="25"/>
+          <w:szCs w:val="25"/>
         </w:rPr>
         <w:t xml:space="preserve">FORMACIÓN ACADÉMICA</w:t>
       </w:r>
@@ -459,8 +459,8 @@
           <w:b/>
           <w:bCs/>
           <w:color w:val="1F3864"/>
-          <w:sz w:val="22"/>
-          <w:szCs w:val="22"/>
+          <w:sz w:val="25"/>
+          <w:szCs w:val="25"/>
         </w:rPr>
         <w:t xml:space="preserve">EXPERIENCIA PROFESIONAL</w:t>
       </w:r>
@@ -600,8 +600,8 @@
           <w:b/>
           <w:bCs/>
           <w:color w:val="1F3864"/>
-          <w:sz w:val="22"/>
-          <w:szCs w:val="22"/>
+          <w:sz w:val="25"/>
+          <w:szCs w:val="25"/>
         </w:rPr>
         <w:t xml:space="preserve">COMPETENCIAS TÉCNICAS</w:t>
       </w:r>
@@ -687,8 +687,8 @@
           <w:b/>
           <w:bCs/>
           <w:color w:val="1F3864"/>
-          <w:sz w:val="22"/>
-          <w:szCs w:val="22"/>
+          <w:sz w:val="25"/>
+          <w:szCs w:val="25"/>
         </w:rPr>
         <w:t xml:space="preserve">PREMIOS Y RECONOCIMIENTOS</w:t>
       </w:r>
@@ -948,7 +948,13 @@
 <file path=word/styles.xml><?xml version="1.0" encoding="utf-8"?>
 <w:styles xmlns:mc="http://schemas.openxmlformats.org/markup-compatibility/2006" xmlns:r="http://schemas.openxmlformats.org/officeDocument/2006/relationships" xmlns:w="http://schemas.openxmlformats.org/wordprocessingml/2006/main" xmlns:w14="http://schemas.microsoft.com/office/word/2010/wordml" xmlns:w15="http://schemas.microsoft.com/office/word/2012/wordml" mc:Ignorable="w14 w15">
   <w:docDefaults>
-    <w:rPrDefault/>
+    <w:rPrDefault>
+      <w:rPr>
+        <w:rFonts w:ascii="Calibri" w:hAnsi="Calibri" w:eastAsia="Calibri" w:cs="Calibri"/>
+        <w:sz w:val="20"/>
+        <w:szCs w:val="20"/>
+      </w:rPr>
+    </w:rPrDefault>
     <w:pPrDefault/>
   </w:docDefaults>
   <w:style w:type="paragraph" w:styleId="Title">

</xml_diff>

<commit_message>
Corrige inconsistencia "con distinción" en el perfil de los 3 CV
La revisión independiente del PR detectó que el cambio a "con
Honores" solo se había aplicado en Formación académica — el párrafo
de Perfil profesional (ES/EN) de los tres CV seguía diciendo
"diploma con distinción"/"with distinction" para el mismo diploma,
una contradicción dentro del mismo documento.

Co-Authored-By: Claude Sonnet 5 <noreply@anthropic.com>
Claude-Session: https://claude.ai/code/session_01HbVaH1DVwrMuTNDFjbaP8S
</commit_message>
<xml_diff>
--- a/personal/cv/cv-mindrift.docx
+++ b/personal/cv/cv-mindrift.docx
@@ -90,7 +90,7 @@
           <w:sz w:val="20"/>
           <w:szCs w:val="20"/>
         </w:rPr>
-        <w:t xml:space="preserve">Ingeniero especialista en sistemas y redes de telecomunicaciones (Universidad Rusa de Transporte, RUT MIIT, diploma con distinción), con formación adicional en análisis predictivo y aprendizaje automático. Trilingüe real: español nativo, ruso C1 (seis años de instrucción universitaria completa en ruso) e inglés C2. Admitido al Máster Universitario en Sistemas Inteligentes (Universidad de Salamanca, España), con inicio el 28 de septiembre de 2026. Combina conocimiento técnico profundo en ingeniería, programación y aprendizaje automático con capacidad real de trabajar y explicar contenido técnico en los tres idiomas.</w:t>
+        <w:t xml:space="preserve">Ingeniero especialista en sistemas y redes de telecomunicaciones (Universidad Rusa de Transporte, RUT MIIT, diploma con honores), con formación adicional en análisis predictivo y aprendizaje automático. Trilingüe real: español nativo, ruso C1 (seis años de instrucción universitaria completa en ruso) e inglés C2. Admitido al Máster Universitario en Sistemas Inteligentes (Universidad de Salamanca, España), con inicio el 28 de septiembre de 2026. Combina conocimiento técnico profundo en ingeniería, programación y aprendizaje automático con capacidad real de trabajar y explicar contenido técnico en los tres idiomas.</w:t>
       </w:r>
     </w:p>
     <w:p>
@@ -117,7 +117,7 @@
           <w:sz w:val="18"/>
           <w:szCs w:val="18"/>
         </w:rPr>
-        <w:t xml:space="preserve">Telecommunications systems and networks engineer (Russian University of Transport, RUT MIIT, diploma with distinction), with additional training in predictive analytics and machine learning. Genuinely trilingual: native Spanish, C1 Russian (six years of full university instruction in Russian), and C2 English. Admitted to the Master's in Intelligent Systems (University of Salamanca, Spain), starting September 28, 2026.</w:t>
+        <w:t xml:space="preserve">Telecommunications systems and networks engineer (Russian University of Transport, RUT MIIT, diploma with honors), with additional training in predictive analytics and machine learning. Genuinely trilingual: native Spanish, C1 Russian (six years of full university instruction in Russian), and C2 English. Admitted to the Master's in Intelligent Systems (University of Salamanca, Spain), starting September 28, 2026.</w:t>
       </w:r>
     </w:p>
     <w:p>

</xml_diff>

<commit_message>
Unifica "Reciclaje Profesional" -> "Recualificación Profesional" en todo el repo
La revisión independiente del PR #96 detectó que el fix anterior
había dejado la carta+cv-docencia-usal.docx consistentes entre sí
pero desalineados del resto del repo. Angel cuestionó el término
"Reciclaje Profesional" y adoptó "Recualificación Profesional" en la
carta sin objetar en varias rondas de edición — se cierra esa
decisión aplicándola de forma consistente en
personal/academico/formacion-academica.md (las dos menciones del tipo
de diploma, no el nombre de la institución "Centro de Formación
Continua y Reciclaje Profesional «Luch Znaniy»", que sí se deja
igual por ser un nombre propio) y en los 3 CV que faltaban
(cv-mindrift.docx tenía dos menciones, cv-python-dev.docx y
cv-telecom-netdevops.docx una cada uno).

Co-Authored-By: Claude Sonnet 5 <noreply@anthropic.com>
Claude-Session: https://claude.ai/code/session_01HbVaH1DVwrMuTNDFjbaP8S
</commit_message>
<xml_diff>
--- a/personal/cv/cv-mindrift.docx
+++ b/personal/cv/cv-mindrift.docx
@@ -334,7 +334,7 @@
           <w:sz w:val="21"/>
           <w:szCs w:val="21"/>
         </w:rPr>
-        <w:t xml:space="preserve">Diploma de Reciclaje Profesional — Análisis Predictivo Aplicado a Problemas del Transporte</w:t>
+        <w:t xml:space="preserve">Diploma de Recualificación Profesional — Análisis Predictivo Aplicado a Problemas del Transporte</w:t>
       </w:r>
       <w:r>
         <w:rPr>
@@ -376,7 +376,7 @@
           <w:sz w:val="21"/>
           <w:szCs w:val="21"/>
         </w:rPr>
-        <w:t xml:space="preserve">Diploma de Reciclaje Profesional — Profesor de Español («Учитель испанского языка»)</w:t>
+        <w:t xml:space="preserve">Diploma de Recualificación Profesional — Profesor de Español («Учитель испанского языка»)</w:t>
       </w:r>
       <w:r>
         <w:rPr>

</xml_diff>